<commit_message>
Thêm BootReport-Health và Phone5s; tách khỏi mục gộp nhầm
Mục BootReport trước đó gộp nhầm hai dự án. Theo repo
nguyenquocanhz/BootReport-Health, BootReport là công cụ kiểm tra sức khoẻ
laptop (PowerShell cho Windows, shell cho Linux/macOS/Termux): đọc thời
gian khởi động, độ chai pin, SMART ổ SSD/NVMe, RAM, lỗi màn hình xanh và
xuất báo cáo HTML. Phone5s là website cửa hàng điện thoại riêng
(Next.js + Spring Boot).

- CV tổng quát: BootReport-Health, Phone5s, QR Wallet; bỏ RapPhim để còn
  khoảng trống, tránh tràn trang khi mở bằng font Windows.
- MemoryZone và KyThuatMayTinh: thêm BootReport-Health lên đầu mục dự án
  và nêu kiểm tra pin, SMART, lỗi màn hình xanh trong dòng kỹ năng phần
  cứng — bằng chứng trực tiếp cho yêu cầu kiến thức laptop của JD.

Co-Authored-By: Claude Opus 5.5 <noreply@anthropic.com>
Claude-Session: https://claude.ai/code/session_01AUAnyX7roVBYFnGRVsCQeQ
</commit_message>
<xml_diff>
--- a/CV-NguyenQuocAnh-TongQuat.docx
+++ b/CV-NguyenQuocAnh-TongQuat.docx
@@ -1330,7 +1330,7 @@
           <w:sz w:val="20"/>
           <w:szCs w:val="20"/>
         </w:rPr>
-        <w:t xml:space="preserve">BootReport</w:t>
+        <w:t xml:space="preserve">BootReport-Health</w:t>
       </w:r>
       <w:r>
         <w:rPr>
@@ -1348,7 +1348,7 @@
           <w:sz w:val="20"/>
           <w:szCs w:val="20"/>
         </w:rPr>
-        <w:t xml:space="preserve">— website cho cửa hàng điện thoại, dự án cá nhân</w:t>
+        <w:t xml:space="preserve">— công cụ kiểm tra sức khoẻ laptop, mã nguồn mở</w:t>
       </w:r>
       <w:r>
         <w:rPr>
@@ -1367,7 +1367,7 @@
           <w:sz w:val="17"/>
           <w:szCs w:val="17"/>
         </w:rPr>
-        <w:t xml:space="preserve">2026</w:t>
+        <w:t xml:space="preserve">10/2026</w:t>
       </w:r>
     </w:p>
     <w:p>
@@ -1386,104 +1386,67 @@
           <w:sz w:val="19"/>
           <w:szCs w:val="19"/>
         </w:rPr>
-        <w:t xml:space="preserve">Tự thiết kế và lập trình trọn bộ: giao diện </w:t>
-      </w:r>
-      <w:r>
-        <w:rPr>
-          <w:rFonts w:ascii="Arial" w:cs="Arial" w:eastAsia="Arial" w:hAnsi="Arial"/>
-          <w:b/>
-          <w:bCs/>
-          <w:color w:val="0B1112"/>
-          <w:sz w:val="19"/>
-          <w:szCs w:val="19"/>
-        </w:rPr>
-        <w:t xml:space="preserve">Next.js</w:t>
-      </w:r>
-      <w:r>
-        <w:rPr>
-          <w:rFonts w:ascii="Arial" w:cs="Arial" w:eastAsia="Arial" w:hAnsi="Arial"/>
-          <w:color w:val="15181A"/>
-          <w:sz w:val="19"/>
-          <w:szCs w:val="19"/>
-        </w:rPr>
-        <w:t xml:space="preserve">, backend </w:t>
-      </w:r>
-      <w:r>
-        <w:rPr>
-          <w:rFonts w:ascii="Arial" w:cs="Arial" w:eastAsia="Arial" w:hAnsi="Arial"/>
-          <w:b/>
-          <w:bCs/>
-          <w:color w:val="0B1112"/>
-          <w:sz w:val="19"/>
-          <w:szCs w:val="19"/>
-        </w:rPr>
-        <w:t xml:space="preserve">Spring Boot</w:t>
-      </w:r>
-      <w:r>
-        <w:rPr>
-          <w:rFonts w:ascii="Arial" w:cs="Arial" w:eastAsia="Arial" w:hAnsi="Arial"/>
-          <w:color w:val="15181A"/>
-          <w:sz w:val="19"/>
-          <w:szCs w:val="19"/>
-        </w:rPr>
-        <w:t xml:space="preserve"> (REST API).  Phone5s.shopmanguon.com</w:t>
-      </w:r>
-    </w:p>
-    <w:p>
-      <w:pPr>
-        <w:keepNext/>
-        <w:tabs>
-          <w:tab w:val="right" w:pos="10546"/>
-        </w:tabs>
-        <w:spacing w:after="20" w:before="90" w:line="252" w:lineRule="auto"/>
-      </w:pPr>
-      <w:r>
-        <w:rPr>
-          <w:rFonts w:ascii="Arial" w:cs="Arial" w:eastAsia="Arial" w:hAnsi="Arial"/>
-          <w:b/>
-          <w:bCs/>
-          <w:color w:val="15181A"/>
-          <w:sz w:val="20"/>
-          <w:szCs w:val="20"/>
-        </w:rPr>
-        <w:t xml:space="preserve">RapPhim WareHouse</w:t>
-      </w:r>
-      <w:r>
-        <w:rPr>
-          <w:rFonts w:ascii="Arial" w:cs="Arial" w:eastAsia="Arial" w:hAnsi="Arial"/>
-          <w:color w:val="33403F"/>
-          <w:sz w:val="20"/>
-          <w:szCs w:val="20"/>
-        </w:rPr>
-        <w:t xml:space="preserve"> </w:t>
-      </w:r>
-      <w:r>
-        <w:rPr>
-          <w:rFonts w:ascii="Arial" w:cs="Arial" w:eastAsia="Arial" w:hAnsi="Arial"/>
-          <w:color w:val="33403F"/>
-          <w:sz w:val="20"/>
-          <w:szCs w:val="20"/>
-        </w:rPr>
-        <w:t xml:space="preserve">— API gateway tổng hợp dữ liệu</w:t>
-      </w:r>
-      <w:r>
-        <w:rPr>
-          <w:rFonts w:ascii="Arial" w:cs="Arial" w:eastAsia="Arial" w:hAnsi="Arial"/>
-          <w:sz w:val="20"/>
-          <w:szCs w:val="20"/>
-        </w:rPr>
-        <w:t xml:space="preserve">	</w:t>
-      </w:r>
-      <w:r>
-        <w:rPr>
-          <w:rFonts w:ascii="Arial" w:cs="Arial" w:eastAsia="Arial" w:hAnsi="Arial"/>
-          <w:b/>
-          <w:bCs/>
-          <w:color w:val="4E5B5C"/>
-          <w:sz w:val="17"/>
-          <w:szCs w:val="17"/>
-        </w:rPr>
-        <w:t xml:space="preserve">09/2026</w:t>
+        <w:t xml:space="preserve">Chạy bằng một dòng lệnh: đọc thời gian khởi động, </w:t>
+      </w:r>
+      <w:r>
+        <w:rPr>
+          <w:rFonts w:ascii="Arial" w:cs="Arial" w:eastAsia="Arial" w:hAnsi="Arial"/>
+          <w:b/>
+          <w:bCs/>
+          <w:color w:val="0B1112"/>
+          <w:sz w:val="19"/>
+          <w:szCs w:val="19"/>
+        </w:rPr>
+        <w:t xml:space="preserve">độ chai pin</w:t>
+      </w:r>
+      <w:r>
+        <w:rPr>
+          <w:rFonts w:ascii="Arial" w:cs="Arial" w:eastAsia="Arial" w:hAnsi="Arial"/>
+          <w:color w:val="15181A"/>
+          <w:sz w:val="19"/>
+          <w:szCs w:val="19"/>
+        </w:rPr>
+        <w:t xml:space="preserve"> và chu kỳ sạc, </w:t>
+      </w:r>
+      <w:r>
+        <w:rPr>
+          <w:rFonts w:ascii="Arial" w:cs="Arial" w:eastAsia="Arial" w:hAnsi="Arial"/>
+          <w:b/>
+          <w:bCs/>
+          <w:color w:val="0B1112"/>
+          <w:sz w:val="19"/>
+          <w:szCs w:val="19"/>
+        </w:rPr>
+        <w:t xml:space="preserve">SMART ổ SSD/NVMe</w:t>
+      </w:r>
+      <w:r>
+        <w:rPr>
+          <w:rFonts w:ascii="Arial" w:cs="Arial" w:eastAsia="Arial" w:hAnsi="Arial"/>
+          <w:color w:val="15181A"/>
+          <w:sz w:val="19"/>
+          <w:szCs w:val="19"/>
+        </w:rPr>
+        <w:t xml:space="preserve">, RAM, lịch sử lỗi </w:t>
+      </w:r>
+      <w:r>
+        <w:rPr>
+          <w:rFonts w:ascii="Arial" w:cs="Arial" w:eastAsia="Arial" w:hAnsi="Arial"/>
+          <w:b/>
+          <w:bCs/>
+          <w:color w:val="0B1112"/>
+          <w:sz w:val="19"/>
+          <w:szCs w:val="19"/>
+        </w:rPr>
+        <w:t xml:space="preserve">màn hình xanh (BSOD)</w:t>
+      </w:r>
+      <w:r>
+        <w:rPr>
+          <w:rFonts w:ascii="Arial" w:cs="Arial" w:eastAsia="Arial" w:hAnsi="Arial"/>
+          <w:color w:val="15181A"/>
+          <w:sz w:val="19"/>
+          <w:szCs w:val="19"/>
+        </w:rPr>
+        <w:t xml:space="preserve"> rồi xuất báo cáo HTML song ngữ Việt – Anh.</w:t>
       </w:r>
     </w:p>
     <w:p>
@@ -1502,27 +1465,123 @@
           <w:sz w:val="19"/>
           <w:szCs w:val="19"/>
         </w:rPr>
-        <w:t xml:space="preserve">Dịch vụ </w:t>
-      </w:r>
-      <w:r>
-        <w:rPr>
-          <w:rFonts w:ascii="Arial" w:cs="Arial" w:eastAsia="Arial" w:hAnsi="Arial"/>
-          <w:b/>
-          <w:bCs/>
-          <w:color w:val="0B1112"/>
-          <w:sz w:val="19"/>
-          <w:szCs w:val="19"/>
-        </w:rPr>
-        <w:t xml:space="preserve">Spring Boot / Java 17</w:t>
-      </w:r>
-      <w:r>
-        <w:rPr>
-          <w:rFonts w:ascii="Arial" w:cs="Arial" w:eastAsia="Arial" w:hAnsi="Arial"/>
-          <w:color w:val="15181A"/>
-          <w:sz w:val="19"/>
-          <w:szCs w:val="19"/>
-        </w:rPr>
-        <w:t xml:space="preserve"> kèm giao diện </w:t>
+        <w:t xml:space="preserve">Bản </w:t>
+      </w:r>
+      <w:r>
+        <w:rPr>
+          <w:rFonts w:ascii="Arial" w:cs="Arial" w:eastAsia="Arial" w:hAnsi="Arial"/>
+          <w:b/>
+          <w:bCs/>
+          <w:color w:val="0B1112"/>
+          <w:sz w:val="19"/>
+          <w:szCs w:val="19"/>
+        </w:rPr>
+        <w:t xml:space="preserve">PowerShell</w:t>
+      </w:r>
+      <w:r>
+        <w:rPr>
+          <w:rFonts w:ascii="Arial" w:cs="Arial" w:eastAsia="Arial" w:hAnsi="Arial"/>
+          <w:color w:val="15181A"/>
+          <w:sz w:val="19"/>
+          <w:szCs w:val="19"/>
+        </w:rPr>
+        <w:t xml:space="preserve"> cho Windows và bản </w:t>
+      </w:r>
+      <w:r>
+        <w:rPr>
+          <w:rFonts w:ascii="Arial" w:cs="Arial" w:eastAsia="Arial" w:hAnsi="Arial"/>
+          <w:b/>
+          <w:bCs/>
+          <w:color w:val="0B1112"/>
+          <w:sz w:val="19"/>
+          <w:szCs w:val="19"/>
+        </w:rPr>
+        <w:t xml:space="preserve">shell</w:t>
+      </w:r>
+      <w:r>
+        <w:rPr>
+          <w:rFonts w:ascii="Arial" w:cs="Arial" w:eastAsia="Arial" w:hAnsi="Arial"/>
+          <w:color w:val="15181A"/>
+          <w:sz w:val="19"/>
+          <w:szCs w:val="19"/>
+        </w:rPr>
+        <w:t xml:space="preserve"> cho Linux, macOS, Android (Termux); chỉ đọc, không sửa hệ thống.  github.com/nguyenquocanhz/BootReport-Health</w:t>
+      </w:r>
+    </w:p>
+    <w:p>
+      <w:pPr>
+        <w:keepNext/>
+        <w:tabs>
+          <w:tab w:val="right" w:pos="10546"/>
+        </w:tabs>
+        <w:spacing w:after="20" w:before="90" w:line="252" w:lineRule="auto"/>
+      </w:pPr>
+      <w:r>
+        <w:rPr>
+          <w:rFonts w:ascii="Arial" w:cs="Arial" w:eastAsia="Arial" w:hAnsi="Arial"/>
+          <w:b/>
+          <w:bCs/>
+          <w:color w:val="15181A"/>
+          <w:sz w:val="20"/>
+          <w:szCs w:val="20"/>
+        </w:rPr>
+        <w:t xml:space="preserve">Phone5s</w:t>
+      </w:r>
+      <w:r>
+        <w:rPr>
+          <w:rFonts w:ascii="Arial" w:cs="Arial" w:eastAsia="Arial" w:hAnsi="Arial"/>
+          <w:color w:val="33403F"/>
+          <w:sz w:val="20"/>
+          <w:szCs w:val="20"/>
+        </w:rPr>
+        <w:t xml:space="preserve"> </w:t>
+      </w:r>
+      <w:r>
+        <w:rPr>
+          <w:rFonts w:ascii="Arial" w:cs="Arial" w:eastAsia="Arial" w:hAnsi="Arial"/>
+          <w:color w:val="33403F"/>
+          <w:sz w:val="20"/>
+          <w:szCs w:val="20"/>
+        </w:rPr>
+        <w:t xml:space="preserve">— website cho cửa hàng điện thoại, dự án cá nhân</w:t>
+      </w:r>
+      <w:r>
+        <w:rPr>
+          <w:rFonts w:ascii="Arial" w:cs="Arial" w:eastAsia="Arial" w:hAnsi="Arial"/>
+          <w:sz w:val="20"/>
+          <w:szCs w:val="20"/>
+        </w:rPr>
+        <w:t xml:space="preserve">	</w:t>
+      </w:r>
+      <w:r>
+        <w:rPr>
+          <w:rFonts w:ascii="Arial" w:cs="Arial" w:eastAsia="Arial" w:hAnsi="Arial"/>
+          <w:b/>
+          <w:bCs/>
+          <w:color w:val="4E5B5C"/>
+          <w:sz w:val="17"/>
+          <w:szCs w:val="17"/>
+        </w:rPr>
+        <w:t xml:space="preserve">2026</w:t>
+      </w:r>
+    </w:p>
+    <w:p>
+      <w:pPr>
+        <w:pStyle w:val="ListParagraph"/>
+        <w:numPr>
+          <w:ilvl w:val="0"/>
+          <w:numId w:val="2"/>
+        </w:numPr>
+        <w:spacing w:after="20" w:line="252" w:lineRule="auto"/>
+      </w:pPr>
+      <w:r>
+        <w:rPr>
+          <w:rFonts w:ascii="Arial" w:cs="Arial" w:eastAsia="Arial" w:hAnsi="Arial"/>
+          <w:color w:val="15181A"/>
+          <w:sz w:val="19"/>
+          <w:szCs w:val="19"/>
+        </w:rPr>
+        <w:t xml:space="preserve">Tự thiết kế và lập trình trọn bộ: giao diện </w:t>
       </w:r>
       <w:r>
         <w:rPr>
@@ -1542,27 +1601,27 @@
           <w:sz w:val="19"/>
           <w:szCs w:val="19"/>
         </w:rPr>
-        <w:t xml:space="preserve">, đóng gói </w:t>
-      </w:r>
-      <w:r>
-        <w:rPr>
-          <w:rFonts w:ascii="Arial" w:cs="Arial" w:eastAsia="Arial" w:hAnsi="Arial"/>
-          <w:b/>
-          <w:bCs/>
-          <w:color w:val="0B1112"/>
-          <w:sz w:val="19"/>
-          <w:szCs w:val="19"/>
-        </w:rPr>
-        <w:t xml:space="preserve">Docker</w:t>
-      </w:r>
-      <w:r>
-        <w:rPr>
-          <w:rFonts w:ascii="Arial" w:cs="Arial" w:eastAsia="Arial" w:hAnsi="Arial"/>
-          <w:color w:val="15181A"/>
-          <w:sz w:val="19"/>
-          <w:szCs w:val="19"/>
-        </w:rPr>
-        <w:t xml:space="preserve">, CI GitHub Actions, có health check và tài liệu OpenAPI.  github.com/nguyenquocanhz/RapPhimWareHouse</w:t>
+        <w:t xml:space="preserve">, backend </w:t>
+      </w:r>
+      <w:r>
+        <w:rPr>
+          <w:rFonts w:ascii="Arial" w:cs="Arial" w:eastAsia="Arial" w:hAnsi="Arial"/>
+          <w:b/>
+          <w:bCs/>
+          <w:color w:val="0B1112"/>
+          <w:sz w:val="19"/>
+          <w:szCs w:val="19"/>
+        </w:rPr>
+        <w:t xml:space="preserve">Spring Boot</w:t>
+      </w:r>
+      <w:r>
+        <w:rPr>
+          <w:rFonts w:ascii="Arial" w:cs="Arial" w:eastAsia="Arial" w:hAnsi="Arial"/>
+          <w:color w:val="15181A"/>
+          <w:sz w:val="19"/>
+          <w:szCs w:val="19"/>
+        </w:rPr>
+        <w:t xml:space="preserve"> (REST API).  phone5s.shopmanguon.com</w:t>
       </w:r>
     </w:p>
     <w:p>

</xml_diff>